<commit_message>
add simulation throughput section to Phase C report
</commit_message>
<xml_diff>
--- a/Team10_VGroup_PhaseC/Team10_VGroup_PhaseC_Report.docx
+++ b/Team10_VGroup_PhaseC/Team10_VGroup_PhaseC_Report.docx
@@ -79,10 +79,7 @@
         <w:spacing w:after="120"/>
       </w:pPr>
       <w:r>
-        <w:t>The component under verification is the i-group's per-intersection signal controller, which is implemented in i_group/scheduler.py and i_group/policy.py and runs once per simulator step on each of the nine intersections in the 3x3 grid defined by shared/topology.py. The controller maintains the active green direction for an intersection, ticks a per-direction green-time counter, and decides at each step whether to keep the current phase, voluntarily switch to a busier direction, or force-switch when MAX_GRE</w:t>
-      </w:r>
-      <w:r>
-        <w:t>EN is reached. The properties we verify are the spec-mandated three (every direction is eventually green, every direction is infinitely often green, exactly one direction is green at any time) and one we chose ourselves: that the active green phase is always one of the topology-valid directions for the intersection.</w:t>
+        <w:t>The component under verification is the i-group's per-intersection signal controller, which is implemented in i_group/scheduler.py and i_group/policy.py and runs once per simulator step on each of the nine intersections in the 3x3 grid defined by shared/topology.py. The controller maintains the active green direction for an intersection, ticks a per-direction green-time counter, and decides at each step whether to keep the current phase, voluntarily switch to a busier direction, or force-switch when MAX_GREEN is reached. The properties we verify are the spec-mandated three (every direction is eventually green, every direction is infinitely often green, exactly one direction is green at any time) and one we chose ourselves: that the active green phase is always one of the topology-valid directions for the intersection.</w:t>
       </w:r>
     </w:p>
     <w:p>
@@ -106,10 +103,7 @@
         <w:spacing w:after="120"/>
       </w:pPr>
       <w:r>
-        <w:t>We selected Spin again for Phase C because the modeling and property language we need are the same ones we already exercised in Phase B Task B.2. The signal controller is a reactive process whose decisions depend only on its local phase, timer, and direction-count inputs; this fits cleanly into a single Promela proctype and lets us state the relevant properties in linear temporal logic (LTL). Spin's verifier explores all reachable states systematically and, for safety properties, gives a complete answer ove</w:t>
-      </w:r>
-      <w:r>
-        <w:t>r the modeled state space; for liveness properties, the -f flag enables weak fairness, which matches the simulator's once-per-step controller invocation.</w:t>
+        <w:t>We selected Spin again for Phase C because the modeling and property language we need are the same ones we already exercised in Phase B Task B.2. The signal controller is a reactive process whose decisions depend only on its local phase, timer, and direction-count inputs; this fits cleanly into a single Promela proctype and lets us state the relevant properties in linear temporal logic (LTL). Spin's verifier explores all reachable states systematically and, for safety properties, gives a complete answer over the modeled state space; for liveness properties, the -f flag enables weak fairness, which matches the simulator's once-per-step controller invocation.</w:t>
       </w:r>
     </w:p>
     <w:p>
@@ -310,10 +304,7 @@
         <w:spacing w:after="120"/>
       </w:pPr>
       <w:r>
-        <w:t>MIN_GREEN and MAX_GREEN are 10 and 40 simulator steps respectively, taken from i_group/scheduler.py. cycle_priority(d) is defined as the negation of (d - cycle_index + 4) % 4, so ties go to the direction nearest to the round-robin pointer. The simulator's published throughput numbers for this controller are 33 successful tours per hour at 6 cars and a best of 48 at 12 cars (simulator/logs/), establishing that the controller is functional under realistic load; our task is to give a stronger temporal-logic gu</w:t>
-      </w:r>
-      <w:r>
-        <w:t>arantee about its behavior.</w:t>
+        <w:t>MIN_GREEN and MAX_GREEN are 10 and 40 simulator steps respectively, taken from i_group/scheduler.py. cycle_priority(d) is defined as the negation of (d - cycle_index + 4) % 4, so ties go to the direction nearest to the round-robin pointer. The simulator's published throughput numbers for this controller are 33 successful tours per hour at 6 cars and a best of 48 at 12 cars (simulator/logs/), establishing that the controller is functional under realistic load; our task is to give a stronger temporal-logic guarantee about its behavior.</w:t>
       </w:r>
     </w:p>
     <w:p>
@@ -345,10 +336,7 @@
         <w:t>Number of intersections.</w:t>
       </w:r>
       <w:r>
-        <w:t xml:space="preserve"> The grid contains nine intersections, but each intersection's policy state (phase, timer, cycle_index) is independent of every other intersection's; nothing in policy.py or scheduler.py reads from a neighbor. Modeling all nine in parallel would inflate the state space by roughly nine orders of magnitude with no new behavior, so we model one worst-case intersection in detail and lift the result to the grid by per-intersection independence. The worst case for properties P1, P2, P3 is the centre intersection </w:t>
-      </w:r>
-      <w:r>
-        <w:t>I11, where all four directions are topology-valid (every direction can carry green); the worst case for the topology-validity property P4 is a corner intersection (we use I00, where only S and E are valid).</w:t>
+        <w:t xml:space="preserve"> The grid contains nine intersections, but each intersection's policy state (phase, timer, cycle_index) is independent of every other intersection's; nothing in policy.py or scheduler.py reads from a neighbor. Modeling all nine in parallel would inflate the state space by roughly nine orders of magnitude with no new behavior, so we model one worst-case intersection in detail and lift the result to the grid by per-intersection independence. The worst case for properties P1, P2, P3 is the centre intersection I11, where all four directions are topology-valid (every direction can carry green); the worst case for the topology-validity property P4 is a corner intersection (we use I00, where only S and E are valid).</w:t>
       </w:r>
     </w:p>
     <w:p>
@@ -363,10 +351,7 @@
         <w:t>Vehicle demand.</w:t>
       </w:r>
       <w:r>
-        <w:t xml:space="preserve"> The voluntary-switch branch of policy.py is the only one that reads the per-direction count; the other three branches depend only on the current phase and timer. To isolate the controller's round-robin tiebreaker (which is the mechanism that prevents starvation under our liveness properties), we model uniform demand: every direction has count 1 at every step. Under uniform demand, the strict-greater test best_other_count &gt; current_count never holds, so voluntary switches do not fire, and phase changes are </w:t>
-      </w:r>
-      <w:r>
-        <w:t>driven entirely by MAX_GREEN with cycle_priority breaking ties. This is the right abstraction for liveness because it removes the input-controlled adversary that could otherwise starve a direction by always raising the count of some other direction at force-switch moments; in particular, P1 and P2 fail under arbitrary demand and are intended to characterise the round-robin guarantee rather than a guarantee against arbitrary inputs.</w:t>
+        <w:t xml:space="preserve"> The voluntary-switch branch of policy.py is the only one that reads the per-direction count; the other three branches depend only on the current phase and timer. To isolate the controller's round-robin tiebreaker (which is the mechanism that prevents starvation under our liveness properties), we model uniform demand: every direction has count 1 at every step. Under uniform demand, the strict-greater test best_other_count &gt; current_count never holds, so voluntary switches do not fire, and phase changes are driven entirely by MAX_GREEN with cycle_priority breaking ties. This is the right abstraction for liveness because it removes the input-controlled adversary that could otherwise starve a direction by always raising the count of some other direction at force-switch moments; in particular, P1 and P2 fail under arbitrary demand and are intended to characterise the round-robin guarantee rather than a guarantee against arbitrary inputs.</w:t>
       </w:r>
     </w:p>
     <w:p>
@@ -1007,10 +992,7 @@
         <w:spacing w:after="120"/>
       </w:pPr>
       <w:r>
-        <w:t>Same Promela file (signal_check.pml). The four green_* booleans are written in lockstep by switch_phase_to, so their joint state is determined by phase. We chose a structural (boolean-per-direction) encoding rather than a derived property like phase in {N,S,E,W} because the boolean encoding catches an entire class of latent encoding bugs: any future code path that updated phase without updating one of the booleans (or vice versa) would falsify the property and Spin would report a counterexample. The derived</w:t>
-      </w:r>
-      <w:r>
-        <w:t xml:space="preserve"> form would silently agree with itself.</w:t>
+        <w:t>Same Promela file (signal_check.pml). The four green_* booleans are written in lockstep by switch_phase_to, so their joint state is determined by phase. We chose a structural (boolean-per-direction) encoding rather than a derived property like phase in {N,S,E,W} because the boolean encoding catches an entire class of latent encoding bugs: any future code path that updated phase without updating one of the booleans (or vice versa) would falsify the property and Spin would report a counterexample. The derived form would silently agree with itself.</w:t>
       </w:r>
     </w:p>
     <w:p>
@@ -1219,10 +1201,7 @@
         <w:spacing w:after="120"/>
       </w:pPr>
       <w:r>
-        <w:t xml:space="preserve">Interpretation: in every reachable state of the controller, exactly one green_* boolean is true. Because the greens are written atomically with phase, this means there is no instant at which two directions show green simultaneously. The verifier reached depth 3633, exhausting the full reachable state space. Note that P3 must hold at depth 0, before any process has stepped, so the model declares the four green_* booleans with explicit inline initialisers (green_N = 1, others = 0) matching phase = N; relying </w:t>
-      </w:r>
-      <w:r>
-        <w:t>on Promela's auto-zero default would falsely violate P3 at the initial state. Log: p3_one_green.txt.</w:t>
+        <w:t>Interpretation: in every reachable state of the controller, exactly one green_* boolean is true. Because the greens are written atomically with phase, this means there is no instant at which two directions show green simultaneously. The verifier reached depth 3633, exhausting the full reachable state space. Note that P3 must hold at depth 0, before any process has stepped, so the model declares the four green_* booleans with explicit inline initialisers (green_N = 1, others = 0) matching phase = N; relying on Promela's auto-zero default would falsely violate P3 at the initial state. Log: p3_one_green.txt.</w:t>
       </w:r>
     </w:p>
     <w:p>
@@ -1246,10 +1225,7 @@
         <w:spacing w:after="120"/>
       </w:pPr>
       <w:r>
-        <w:t>The three mandatory properties characterise scheduling fairness and mutual exclusion at a worst-case interior intersection. The structurally weakest intersections are the four corners of the 3x3 grid, where two of the four cardinal directions have no outgoing road in shared/topology.py. Granting green to one of those non-existent legs is meaningless from a traffic-flow perspective and is forbidden by the topology specification. We chose this as our v-group property because, unlike a hard-coded constant such</w:t>
-      </w:r>
-      <w:r>
-        <w:t xml:space="preserve"> as MAX_GREEN, it expresses an interaction between two independently maintained pieces of the system (the per-intersection valid set in topology.py and the per-intersection initial phase in scheduler.py); a discrepancy between them is exactly the kind of bug that simulation may not exercise but that model checking can find.</w:t>
+        <w:t>The three mandatory properties characterise scheduling fairness and mutual exclusion at a worst-case interior intersection. The structurally weakest intersections are the four corners of the 3x3 grid, where two of the four cardinal directions have no outgoing road in shared/topology.py. Granting green to one of those non-existent legs is meaningless from a traffic-flow perspective and is forbidden by the topology specification. We chose this as our v-group property because, unlike a hard-coded constant such as MAX_GREEN, it expresses an interaction between two independently maintained pieces of the system (the per-intersection valid set in topology.py and the per-intersection initial phase in scheduler.py); a discrepancy between them is exactly the kind of bug that simulation may not exercise but that model checking can find.</w:t>
       </w:r>
     </w:p>
     <w:p>
@@ -1265,10 +1241,7 @@
         <w:spacing w:after="120"/>
       </w:pPr>
       <w:r>
-        <w:t>We instantiate this property at I00 (top-left corner), where the topology-valid set is {S, E}. Two model files share the same controller logic but differ in their inline initialisers: signal_check_corner.pml declares byte phase = N (the original scheduler's default), and signal_check_corner_fixed.pml declares byte phase = E (the proposed fix). They differ from signal_check.pml in two ways: an IS_VALID(d) macro encodes the corner's valid set, and the Promela controller includes the topology-invalid correctio</w:t>
-      </w:r>
-      <w:r>
-        <w:t>n branch from policy.py (decision branch 0 in our enumeration of Section 5.1), which is unreachable at I11 but critical here. The initial phase is set inline at the top of each file, ensuring Spin sees the correct (or buggy) value at depth 0; relying on Promela's auto-zero default or setting it inside the controller's first atomic block would be too late, because LTL formulas are evaluated at the initial state before any process has stepped.</w:t>
+        <w:t>We instantiate this property at I00 (top-left corner), where the topology-valid set is {S, E}. Two model files share the same controller logic but differ in their inline initialisers: signal_check_corner.pml declares byte phase = N (the original scheduler's default), and signal_check_corner_fixed.pml declares byte phase = E (the proposed fix). They differ from signal_check.pml in two ways: an IS_VALID(d) macro encodes the corner's valid set, and the Promela controller includes the topology-invalid correction branch from policy.py (decision branch 0 in our enumeration of Section 5.1), which is unreachable at I11 but critical here. The initial phase is set inline at the top of each file, ensuring Spin sees the correct (or buggy) value at depth 0; relying on Promela's auto-zero default or setting it inside the controller's first atomic block would be too late, because LTL formulas are evaluated at the initial state before any process has stepped.</w:t>
       </w:r>
     </w:p>
     <w:p>
@@ -1434,10 +1407,7 @@
         <w:spacing w:after="120"/>
       </w:pPr>
       <w:r>
-        <w:t xml:space="preserve">Replaying the trail with spin -t signal_check_corner.pml prints the initial state, in which phase = 0 (i.e. N). N is not in I00's valid set {S, E}, so the property is violated by the very first state of every execution. In the simulator this transient is corrected on the first call to policy.SignalPolicy.decide(), which detects the invalid phase via its topology-invalid-correction branch and switches to a valid direction immediately; no vehicle is ever queried about the phase before that first decide. Spin </w:t>
-      </w:r>
-      <w:r>
-        <w:t>nevertheless flags the literal property violation at the initial state, which is the correct behaviour for a safety LTL formula. Logs: p4_topology_valid_original.txt and p4_counterexample_trail.txt.</w:t>
+        <w:t>Replaying the trail with spin -t signal_check_corner.pml prints the initial state, in which phase = 0 (i.e. N). N is not in I00's valid set {S, E}, so the property is violated by the very first state of every execution. In the simulator this transient is corrected on the first call to policy.SignalPolicy.decide(), which detects the invalid phase via its topology-invalid-correction branch and switches to a valid direction immediately; no vehicle is ever queried about the phase before that first decide. Spin nevertheless flags the literal property violation at the initial state, which is the correct behaviour for a safety LTL formula. Logs: p4_topology_valid_original.txt and p4_counterexample_trail.txt.</w:t>
       </w:r>
     </w:p>
     <w:p>
@@ -1633,21 +1603,15 @@
         <w:spacing w:after="120"/>
       </w:pPr>
       <w:r>
-        <w:t>The verification confirms the three mandatory v-group properties on the worst-case intersection under uniform demand and on the round-robin tiebreaker that drives switching when the voluntary branch is dormant. Together with the per-intersection independence of policy.py and scheduler.py, the result lifts to the full 3x3 grid for every intersection in the topology, and the boolean-per-direction encoding of P3 makes the safety result robust against future encoding-only refactors. P4 surfaced a genuine but ob</w:t>
-      </w:r>
-      <w:r>
-        <w:t>servable-only-at-initialisation bug in scheduler.initialize and we proposed a one-line fix; signal_check_corner_fixed.pml verifies that the fix closes the gap.</w:t>
-      </w:r>
-    </w:p>
-    <w:p>
-      <w:pPr>
-        <w:spacing w:after="120"/>
-      </w:pPr>
-      <w:r>
-        <w:t>The most important limitation is the uniform-demand abstraction. Under arbitrary demand, the voluntary-switch branch can fire at any timer value above MIN_GREEN, and an adversarial input sequence can starve a particular direction (consider an input that holds cnt[N] = 0 forever while keeping cnt[S] high). P1 and P2 are not intended to hold against such adversaries; they characterise the round-robin guarantee, which is what the controller's force-switch and cycle_priority logic deliver. Verifying liveness un</w:t>
-      </w:r>
-      <w:r>
-        <w:t>der arbitrary demand would require either a stronger fairness assumption on the inputs or a property that explicitly conditions on demand, and is out of scope for this report.</w:t>
+        <w:t>The verification confirms the three mandatory v-group properties on the worst-case intersection under uniform demand and on the round-robin tiebreaker that drives switching when the voluntary branch is dormant. Together with the per-intersection independence of policy.py and scheduler.py, the result lifts to the full 3x3 grid for every intersection in the topology, and the boolean-per-direction encoding of P3 makes the safety result robust against future encoding-only refactors. P4 surfaced a genuine but observable-only-at-initialisation bug in scheduler.initialize and we proposed a one-line fix; signal_check_corner_fixed.pml verifies that the fix closes the gap.</w:t>
+      </w:r>
+    </w:p>
+    <w:p>
+      <w:pPr>
+        <w:spacing w:after="120"/>
+      </w:pPr>
+      <w:r>
+        <w:t>The most important limitation is the uniform-demand abstraction. Under arbitrary demand, the voluntary-switch branch can fire at any timer value above MIN_GREEN, and an adversarial input sequence can starve a particular direction (consider an input that holds cnt[N] = 0 forever while keeping cnt[S] high). P1 and P2 are not intended to hold against such adversaries; they characterise the round-robin guarantee, which is what the controller's force-switch and cycle_priority logic deliver. Verifying liveness under arbitrary demand would require either a stronger fairness assumption on the inputs or a property that explicitly conditions on demand, and is out of scope for this report.</w:t>
       </w:r>
     </w:p>
     <w:p>
@@ -1663,18 +1627,1169 @@
         <w:pStyle w:val="1"/>
       </w:pPr>
       <w:r>
-        <w:t>11. Conclusion</w:t>
-      </w:r>
-    </w:p>
-    <w:p>
-      <w:pPr>
-        <w:spacing w:after="120"/>
-      </w:pPr>
-      <w:r>
-        <w:t>We modelled the i-group signal controller in Promela and used Spin to verify the three v-group spec properties (every direction eventually green, every direction infinitely often green, exactly one direction green at any time) on a worst-case interior intersection under uniform demand, and one self-chosen property (topology validity) on a corner intersection. P1, P2, and P3 hold; P4 fails on the original scheduler with a one-step counterexample at initialisation, and holds after a one-line patch to schedule</w:t>
-      </w:r>
-      <w:r>
-        <w:t>r.initialize that we propose. The Promela files (signal_check.pml, signal_check_corner.pml, signal_check_corner_fixed.pml), the driver script (run_all.sh), and the saved logs are submitted alongside this report.</w:t>
+        <w:t>11. Simulation Throughput and Safety Metrics</w:t>
+      </w:r>
+    </w:p>
+    <w:p>
+      <w:r>
+        <w:t>The Phase C specification also requires reporting simulation throughput and safety counters. The baseline run uses a 6-car fleet simulated for 3600 seconds (1 simulated hour, 1800 steps). A bottleneck sweep scales the fleet from 6 to 60 cars to find the peak-throughput configuration.</w:t>
+      </w:r>
+    </w:p>
+    <w:p>
+      <w:pPr>
+        <w:pStyle w:val="2"/>
+      </w:pPr>
+      <w:r>
+        <w:t>11.1  Baseline Run  (6 Cars, 1 Hour)</w:t>
+      </w:r>
+    </w:p>
+    <w:tbl>
+      <w:tblPr>
+        <w:tblW w:w="0" w:type="auto"/>
+        <w:tblBorders>
+          <w:top w:val="single" w:sz="4" w:space="0" w:color="000000"/>
+          <w:left w:val="single" w:sz="4" w:space="0" w:color="000000"/>
+          <w:bottom w:val="single" w:sz="4" w:space="0" w:color="000000"/>
+          <w:right w:val="single" w:sz="4" w:space="0" w:color="000000"/>
+          <w:insideH w:val="single" w:sz="4" w:space="0" w:color="000000"/>
+          <w:insideV w:val="single" w:sz="4" w:space="0" w:color="000000"/>
+        </w:tblBorders>
+        <w:tblLook w:val="04A0" w:firstRow="1" w:lastRow="0" w:firstColumn="1" w:lastColumn="0" w:noHBand="0" w:noVBand="1"/>
+      </w:tblPr>
+      <w:tblGrid>
+        <w:gridCol w:w="4675"/>
+        <w:gridCol w:w="4675"/>
+      </w:tblGrid>
+      <w:tr>
+        <w:tc>
+          <w:tcPr>
+            <w:tcW w:w="4680" w:type="dxa"/>
+          </w:tcPr>
+          <w:p>
+            <w:r>
+              <w:rPr>
+                <w:b/>
+              </w:rPr>
+              <w:t>Metric</w:t>
+            </w:r>
+          </w:p>
+        </w:tc>
+        <w:tc>
+          <w:tcPr>
+            <w:tcW w:w="4680" w:type="dxa"/>
+          </w:tcPr>
+          <w:p>
+            <w:r>
+              <w:rPr>
+                <w:b/>
+              </w:rPr>
+              <w:t>Value</w:t>
+            </w:r>
+          </w:p>
+        </w:tc>
+      </w:tr>
+      <w:tr>
+        <w:tc>
+          <w:tcPr>
+            <w:tcW w:w="4680" w:type="dxa"/>
+          </w:tcPr>
+          <w:p>
+            <w:r>
+              <w:t>Simulated duration</w:t>
+            </w:r>
+          </w:p>
+        </w:tc>
+        <w:tc>
+          <w:tcPr>
+            <w:tcW w:w="4680" w:type="dxa"/>
+          </w:tcPr>
+          <w:p>
+            <w:r>
+              <w:t>1 hour  (3600 s, 1800 steps)</w:t>
+            </w:r>
+          </w:p>
+        </w:tc>
+      </w:tr>
+      <w:tr>
+        <w:tc>
+          <w:tcPr>
+            <w:tcW w:w="4680" w:type="dxa"/>
+          </w:tcPr>
+          <w:p>
+            <w:r>
+              <w:t>Fleet size</w:t>
+            </w:r>
+          </w:p>
+        </w:tc>
+        <w:tc>
+          <w:tcPr>
+            <w:tcW w:w="4680" w:type="dxa"/>
+          </w:tcPr>
+          <w:p>
+            <w:r>
+              <w:t>6 cars</w:t>
+            </w:r>
+          </w:p>
+        </w:tc>
+      </w:tr>
+      <w:tr>
+        <w:tc>
+          <w:tcPr>
+            <w:tcW w:w="4680" w:type="dxa"/>
+          </w:tcPr>
+          <w:p>
+            <w:r>
+              <w:t>Completed tours</w:t>
+            </w:r>
+          </w:p>
+        </w:tc>
+        <w:tc>
+          <w:tcPr>
+            <w:tcW w:w="4680" w:type="dxa"/>
+          </w:tcPr>
+          <w:p>
+            <w:r>
+              <w:t>33</w:t>
+            </w:r>
+          </w:p>
+        </w:tc>
+      </w:tr>
+      <w:tr>
+        <w:tc>
+          <w:tcPr>
+            <w:tcW w:w="4680" w:type="dxa"/>
+          </w:tcPr>
+          <w:p>
+            <w:r>
+              <w:lastRenderedPageBreak/>
+              <w:t>Throughput</w:t>
+            </w:r>
+          </w:p>
+        </w:tc>
+        <w:tc>
+          <w:tcPr>
+            <w:tcW w:w="4680" w:type="dxa"/>
+          </w:tcPr>
+          <w:p>
+            <w:r>
+              <w:t>33.0 tours / hr</w:t>
+            </w:r>
+          </w:p>
+        </w:tc>
+      </w:tr>
+      <w:tr>
+        <w:tc>
+          <w:tcPr>
+            <w:tcW w:w="4680" w:type="dxa"/>
+          </w:tcPr>
+          <w:p>
+            <w:r>
+              <w:t>Collisions</w:t>
+            </w:r>
+          </w:p>
+        </w:tc>
+        <w:tc>
+          <w:tcPr>
+            <w:tcW w:w="4680" w:type="dxa"/>
+          </w:tcPr>
+          <w:p>
+            <w:r>
+              <w:t>0</w:t>
+            </w:r>
+          </w:p>
+        </w:tc>
+      </w:tr>
+      <w:tr>
+        <w:tc>
+          <w:tcPr>
+            <w:tcW w:w="4680" w:type="dxa"/>
+          </w:tcPr>
+          <w:p>
+            <w:r>
+              <w:t>Red-light violations</w:t>
+            </w:r>
+          </w:p>
+        </w:tc>
+        <w:tc>
+          <w:tcPr>
+            <w:tcW w:w="4680" w:type="dxa"/>
+          </w:tcPr>
+          <w:p>
+            <w:r>
+              <w:t>0</w:t>
+            </w:r>
+          </w:p>
+        </w:tc>
+      </w:tr>
+      <w:tr>
+        <w:tc>
+          <w:tcPr>
+            <w:tcW w:w="4680" w:type="dxa"/>
+          </w:tcPr>
+          <w:p>
+            <w:r>
+              <w:t>Illegal running directions</w:t>
+            </w:r>
+          </w:p>
+        </w:tc>
+        <w:tc>
+          <w:tcPr>
+            <w:tcW w:w="4680" w:type="dxa"/>
+          </w:tcPr>
+          <w:p>
+            <w:r>
+              <w:t>0</w:t>
+            </w:r>
+          </w:p>
+        </w:tc>
+      </w:tr>
+      <w:tr>
+        <w:tc>
+          <w:tcPr>
+            <w:tcW w:w="4680" w:type="dxa"/>
+          </w:tcPr>
+          <w:p>
+            <w:r>
+              <w:t>U-turns</w:t>
+            </w:r>
+          </w:p>
+        </w:tc>
+        <w:tc>
+          <w:tcPr>
+            <w:tcW w:w="4680" w:type="dxa"/>
+          </w:tcPr>
+          <w:p>
+            <w:r>
+              <w:t>0</w:t>
+            </w:r>
+          </w:p>
+        </w:tc>
+      </w:tr>
+    </w:tbl>
+    <w:p>
+      <w:pPr>
+        <w:pStyle w:val="2"/>
+      </w:pPr>
+      <w:r>
+        <w:t>11.2  Bottleneck Search  (6 – 60 Cars)</w:t>
+      </w:r>
+    </w:p>
+    <w:p>
+      <w:r>
+        <w:t>A fleet-size sweep from 6 to 60 cars was run, each for one simulated hour. Throughput peaked at 12 cars (48.0 tours/hr) and first dropped at 14 cars.</w:t>
+      </w:r>
+    </w:p>
+    <w:tbl>
+      <w:tblPr>
+        <w:tblW w:w="0" w:type="auto"/>
+        <w:tblBorders>
+          <w:top w:val="single" w:sz="4" w:space="0" w:color="000000"/>
+          <w:left w:val="single" w:sz="4" w:space="0" w:color="000000"/>
+          <w:bottom w:val="single" w:sz="4" w:space="0" w:color="000000"/>
+          <w:right w:val="single" w:sz="4" w:space="0" w:color="000000"/>
+          <w:insideH w:val="single" w:sz="4" w:space="0" w:color="000000"/>
+          <w:insideV w:val="single" w:sz="4" w:space="0" w:color="000000"/>
+        </w:tblBorders>
+        <w:tblLook w:val="04A0" w:firstRow="1" w:lastRow="0" w:firstColumn="1" w:lastColumn="0" w:noHBand="0" w:noVBand="1"/>
+      </w:tblPr>
+      <w:tblGrid>
+        <w:gridCol w:w="1335"/>
+        <w:gridCol w:w="1337"/>
+        <w:gridCol w:w="1336"/>
+        <w:gridCol w:w="1335"/>
+        <w:gridCol w:w="1335"/>
+        <w:gridCol w:w="1335"/>
+        <w:gridCol w:w="1337"/>
+      </w:tblGrid>
+      <w:tr>
+        <w:tc>
+          <w:tcPr>
+            <w:tcW w:w="1337" w:type="dxa"/>
+          </w:tcPr>
+          <w:p>
+            <w:r>
+              <w:rPr>
+                <w:b/>
+              </w:rPr>
+              <w:t>Cars</w:t>
+            </w:r>
+          </w:p>
+        </w:tc>
+        <w:tc>
+          <w:tcPr>
+            <w:tcW w:w="1337" w:type="dxa"/>
+          </w:tcPr>
+          <w:p>
+            <w:r>
+              <w:rPr>
+                <w:b/>
+              </w:rPr>
+              <w:t>Throughput (tours/hr)</w:t>
+            </w:r>
+          </w:p>
+        </w:tc>
+        <w:tc>
+          <w:tcPr>
+            <w:tcW w:w="1337" w:type="dxa"/>
+          </w:tcPr>
+          <w:p>
+            <w:r>
+              <w:rPr>
+                <w:b/>
+              </w:rPr>
+              <w:t>Collisions</w:t>
+            </w:r>
+          </w:p>
+        </w:tc>
+        <w:tc>
+          <w:tcPr>
+            <w:tcW w:w="1337" w:type="dxa"/>
+          </w:tcPr>
+          <w:p>
+            <w:r>
+              <w:rPr>
+                <w:b/>
+              </w:rPr>
+              <w:t>Red-light</w:t>
+            </w:r>
+          </w:p>
+        </w:tc>
+        <w:tc>
+          <w:tcPr>
+            <w:tcW w:w="1337" w:type="dxa"/>
+          </w:tcPr>
+          <w:p>
+            <w:r>
+              <w:rPr>
+                <w:b/>
+              </w:rPr>
+              <w:t>Illegal Dir</w:t>
+            </w:r>
+          </w:p>
+        </w:tc>
+        <w:tc>
+          <w:tcPr>
+            <w:tcW w:w="1337" w:type="dxa"/>
+          </w:tcPr>
+          <w:p>
+            <w:r>
+              <w:rPr>
+                <w:b/>
+              </w:rPr>
+              <w:t>U-turns</w:t>
+            </w:r>
+          </w:p>
+        </w:tc>
+        <w:tc>
+          <w:tcPr>
+            <w:tcW w:w="1337" w:type="dxa"/>
+          </w:tcPr>
+          <w:p>
+            <w:r>
+              <w:rPr>
+                <w:b/>
+              </w:rPr>
+              <w:t>Status</w:t>
+            </w:r>
+          </w:p>
+        </w:tc>
+      </w:tr>
+      <w:tr>
+        <w:tc>
+          <w:tcPr>
+            <w:tcW w:w="1337" w:type="dxa"/>
+          </w:tcPr>
+          <w:p>
+            <w:r>
+              <w:t>6</w:t>
+            </w:r>
+          </w:p>
+        </w:tc>
+        <w:tc>
+          <w:tcPr>
+            <w:tcW w:w="1337" w:type="dxa"/>
+          </w:tcPr>
+          <w:p>
+            <w:r>
+              <w:t>33.0</w:t>
+            </w:r>
+          </w:p>
+        </w:tc>
+        <w:tc>
+          <w:tcPr>
+            <w:tcW w:w="1337" w:type="dxa"/>
+          </w:tcPr>
+          <w:p>
+            <w:r>
+              <w:t>0</w:t>
+            </w:r>
+          </w:p>
+        </w:tc>
+        <w:tc>
+          <w:tcPr>
+            <w:tcW w:w="1337" w:type="dxa"/>
+          </w:tcPr>
+          <w:p>
+            <w:r>
+              <w:t>0</w:t>
+            </w:r>
+          </w:p>
+        </w:tc>
+        <w:tc>
+          <w:tcPr>
+            <w:tcW w:w="1337" w:type="dxa"/>
+          </w:tcPr>
+          <w:p>
+            <w:r>
+              <w:t>0</w:t>
+            </w:r>
+          </w:p>
+        </w:tc>
+        <w:tc>
+          <w:tcPr>
+            <w:tcW w:w="1337" w:type="dxa"/>
+          </w:tcPr>
+          <w:p>
+            <w:r>
+              <w:t>0</w:t>
+            </w:r>
+          </w:p>
+        </w:tc>
+        <w:tc>
+          <w:tcPr>
+            <w:tcW w:w="1337" w:type="dxa"/>
+          </w:tcPr>
+          <w:p>
+            <w:r>
+              <w:t>ok</w:t>
+            </w:r>
+          </w:p>
+        </w:tc>
+      </w:tr>
+      <w:tr>
+        <w:tc>
+          <w:tcPr>
+            <w:tcW w:w="1337" w:type="dxa"/>
+          </w:tcPr>
+          <w:p>
+            <w:r>
+              <w:t>8</w:t>
+            </w:r>
+          </w:p>
+        </w:tc>
+        <w:tc>
+          <w:tcPr>
+            <w:tcW w:w="1337" w:type="dxa"/>
+          </w:tcPr>
+          <w:p>
+            <w:r>
+              <w:t>42.0</w:t>
+            </w:r>
+          </w:p>
+        </w:tc>
+        <w:tc>
+          <w:tcPr>
+            <w:tcW w:w="1337" w:type="dxa"/>
+          </w:tcPr>
+          <w:p>
+            <w:r>
+              <w:t>0</w:t>
+            </w:r>
+          </w:p>
+        </w:tc>
+        <w:tc>
+          <w:tcPr>
+            <w:tcW w:w="1337" w:type="dxa"/>
+          </w:tcPr>
+          <w:p>
+            <w:r>
+              <w:t>0</w:t>
+            </w:r>
+          </w:p>
+        </w:tc>
+        <w:tc>
+          <w:tcPr>
+            <w:tcW w:w="1337" w:type="dxa"/>
+          </w:tcPr>
+          <w:p>
+            <w:r>
+              <w:t>0</w:t>
+            </w:r>
+          </w:p>
+        </w:tc>
+        <w:tc>
+          <w:tcPr>
+            <w:tcW w:w="1337" w:type="dxa"/>
+          </w:tcPr>
+          <w:p>
+            <w:r>
+              <w:t>0</w:t>
+            </w:r>
+          </w:p>
+        </w:tc>
+        <w:tc>
+          <w:tcPr>
+            <w:tcW w:w="1337" w:type="dxa"/>
+          </w:tcPr>
+          <w:p>
+            <w:r>
+              <w:t>ok</w:t>
+            </w:r>
+          </w:p>
+        </w:tc>
+      </w:tr>
+      <w:tr>
+        <w:tc>
+          <w:tcPr>
+            <w:tcW w:w="1337" w:type="dxa"/>
+          </w:tcPr>
+          <w:p>
+            <w:r>
+              <w:t>10</w:t>
+            </w:r>
+          </w:p>
+        </w:tc>
+        <w:tc>
+          <w:tcPr>
+            <w:tcW w:w="1337" w:type="dxa"/>
+          </w:tcPr>
+          <w:p>
+            <w:r>
+              <w:t>46.0</w:t>
+            </w:r>
+          </w:p>
+        </w:tc>
+        <w:tc>
+          <w:tcPr>
+            <w:tcW w:w="1337" w:type="dxa"/>
+          </w:tcPr>
+          <w:p>
+            <w:r>
+              <w:t>0</w:t>
+            </w:r>
+          </w:p>
+        </w:tc>
+        <w:tc>
+          <w:tcPr>
+            <w:tcW w:w="1337" w:type="dxa"/>
+          </w:tcPr>
+          <w:p>
+            <w:r>
+              <w:t>0</w:t>
+            </w:r>
+          </w:p>
+        </w:tc>
+        <w:tc>
+          <w:tcPr>
+            <w:tcW w:w="1337" w:type="dxa"/>
+          </w:tcPr>
+          <w:p>
+            <w:r>
+              <w:t>0</w:t>
+            </w:r>
+          </w:p>
+        </w:tc>
+        <w:tc>
+          <w:tcPr>
+            <w:tcW w:w="1337" w:type="dxa"/>
+          </w:tcPr>
+          <w:p>
+            <w:r>
+              <w:t>0</w:t>
+            </w:r>
+          </w:p>
+        </w:tc>
+        <w:tc>
+          <w:tcPr>
+            <w:tcW w:w="1337" w:type="dxa"/>
+          </w:tcPr>
+          <w:p>
+            <w:r>
+              <w:t>ok</w:t>
+            </w:r>
+          </w:p>
+        </w:tc>
+      </w:tr>
+      <w:tr>
+        <w:tc>
+          <w:tcPr>
+            <w:tcW w:w="1337" w:type="dxa"/>
+          </w:tcPr>
+          <w:p>
+            <w:r>
+              <w:t>12</w:t>
+            </w:r>
+          </w:p>
+        </w:tc>
+        <w:tc>
+          <w:tcPr>
+            <w:tcW w:w="1337" w:type="dxa"/>
+          </w:tcPr>
+          <w:p>
+            <w:r>
+              <w:t>48.0</w:t>
+            </w:r>
+          </w:p>
+        </w:tc>
+        <w:tc>
+          <w:tcPr>
+            <w:tcW w:w="1337" w:type="dxa"/>
+          </w:tcPr>
+          <w:p>
+            <w:r>
+              <w:t>0</w:t>
+            </w:r>
+          </w:p>
+        </w:tc>
+        <w:tc>
+          <w:tcPr>
+            <w:tcW w:w="1337" w:type="dxa"/>
+          </w:tcPr>
+          <w:p>
+            <w:r>
+              <w:t>0</w:t>
+            </w:r>
+          </w:p>
+        </w:tc>
+        <w:tc>
+          <w:tcPr>
+            <w:tcW w:w="1337" w:type="dxa"/>
+          </w:tcPr>
+          <w:p>
+            <w:r>
+              <w:t>0</w:t>
+            </w:r>
+          </w:p>
+        </w:tc>
+        <w:tc>
+          <w:tcPr>
+            <w:tcW w:w="1337" w:type="dxa"/>
+          </w:tcPr>
+          <w:p>
+            <w:r>
+              <w:t>0</w:t>
+            </w:r>
+          </w:p>
+        </w:tc>
+        <w:tc>
+          <w:tcPr>
+            <w:tcW w:w="1337" w:type="dxa"/>
+          </w:tcPr>
+          <w:p>
+            <w:r>
+              <w:t>ok  ← peak</w:t>
+            </w:r>
+          </w:p>
+        </w:tc>
+      </w:tr>
+      <w:tr>
+        <w:tc>
+          <w:tcPr>
+            <w:tcW w:w="1337" w:type="dxa"/>
+          </w:tcPr>
+          <w:p>
+            <w:r>
+              <w:t>14</w:t>
+            </w:r>
+          </w:p>
+        </w:tc>
+        <w:tc>
+          <w:tcPr>
+            <w:tcW w:w="1337" w:type="dxa"/>
+          </w:tcPr>
+          <w:p>
+            <w:r>
+              <w:t>47.0</w:t>
+            </w:r>
+          </w:p>
+        </w:tc>
+        <w:tc>
+          <w:tcPr>
+            <w:tcW w:w="1337" w:type="dxa"/>
+          </w:tcPr>
+          <w:p>
+            <w:r>
+              <w:t>0</w:t>
+            </w:r>
+          </w:p>
+        </w:tc>
+        <w:tc>
+          <w:tcPr>
+            <w:tcW w:w="1337" w:type="dxa"/>
+          </w:tcPr>
+          <w:p>
+            <w:r>
+              <w:t>0</w:t>
+            </w:r>
+          </w:p>
+        </w:tc>
+        <w:tc>
+          <w:tcPr>
+            <w:tcW w:w="1337" w:type="dxa"/>
+          </w:tcPr>
+          <w:p>
+            <w:r>
+              <w:t>0</w:t>
+            </w:r>
+          </w:p>
+        </w:tc>
+        <w:tc>
+          <w:tcPr>
+            <w:tcW w:w="1337" w:type="dxa"/>
+          </w:tcPr>
+          <w:p>
+            <w:r>
+              <w:t>0</w:t>
+            </w:r>
+          </w:p>
+        </w:tc>
+        <w:tc>
+          <w:tcPr>
+            <w:tcW w:w="1337" w:type="dxa"/>
+          </w:tcPr>
+          <w:p>
+            <w:r>
+              <w:t>DROP  ← bottleneck</w:t>
+            </w:r>
+          </w:p>
+        </w:tc>
+      </w:tr>
+      <w:tr>
+        <w:tc>
+          <w:tcPr>
+            <w:tcW w:w="1337" w:type="dxa"/>
+          </w:tcPr>
+          <w:p>
+            <w:r>
+              <w:t>16</w:t>
+            </w:r>
+          </w:p>
+        </w:tc>
+        <w:tc>
+          <w:tcPr>
+            <w:tcW w:w="1337" w:type="dxa"/>
+          </w:tcPr>
+          <w:p>
+            <w:r>
+              <w:t>46.0</w:t>
+            </w:r>
+          </w:p>
+        </w:tc>
+        <w:tc>
+          <w:tcPr>
+            <w:tcW w:w="1337" w:type="dxa"/>
+          </w:tcPr>
+          <w:p>
+            <w:r>
+              <w:t>0</w:t>
+            </w:r>
+          </w:p>
+        </w:tc>
+        <w:tc>
+          <w:tcPr>
+            <w:tcW w:w="1337" w:type="dxa"/>
+          </w:tcPr>
+          <w:p>
+            <w:r>
+              <w:t>0</w:t>
+            </w:r>
+          </w:p>
+        </w:tc>
+        <w:tc>
+          <w:tcPr>
+            <w:tcW w:w="1337" w:type="dxa"/>
+          </w:tcPr>
+          <w:p>
+            <w:r>
+              <w:t>0</w:t>
+            </w:r>
+          </w:p>
+        </w:tc>
+        <w:tc>
+          <w:tcPr>
+            <w:tcW w:w="1337" w:type="dxa"/>
+          </w:tcPr>
+          <w:p>
+            <w:r>
+              <w:t>0</w:t>
+            </w:r>
+          </w:p>
+        </w:tc>
+        <w:tc>
+          <w:tcPr>
+            <w:tcW w:w="1337" w:type="dxa"/>
+          </w:tcPr>
+          <w:p>
+            <w:r>
+              <w:t>DROP</w:t>
+            </w:r>
+          </w:p>
+        </w:tc>
+      </w:tr>
+      <w:tr>
+        <w:tc>
+          <w:tcPr>
+            <w:tcW w:w="1337" w:type="dxa"/>
+          </w:tcPr>
+          <w:p>
+            <w:r>
+              <w:t>18</w:t>
+            </w:r>
+          </w:p>
+        </w:tc>
+        <w:tc>
+          <w:tcPr>
+            <w:tcW w:w="1337" w:type="dxa"/>
+          </w:tcPr>
+          <w:p>
+            <w:r>
+              <w:t>40.0</w:t>
+            </w:r>
+          </w:p>
+        </w:tc>
+        <w:tc>
+          <w:tcPr>
+            <w:tcW w:w="1337" w:type="dxa"/>
+          </w:tcPr>
+          <w:p>
+            <w:r>
+              <w:t>0</w:t>
+            </w:r>
+          </w:p>
+        </w:tc>
+        <w:tc>
+          <w:tcPr>
+            <w:tcW w:w="1337" w:type="dxa"/>
+          </w:tcPr>
+          <w:p>
+            <w:r>
+              <w:t>0</w:t>
+            </w:r>
+          </w:p>
+        </w:tc>
+        <w:tc>
+          <w:tcPr>
+            <w:tcW w:w="1337" w:type="dxa"/>
+          </w:tcPr>
+          <w:p>
+            <w:r>
+              <w:t>0</w:t>
+            </w:r>
+          </w:p>
+        </w:tc>
+        <w:tc>
+          <w:tcPr>
+            <w:tcW w:w="1337" w:type="dxa"/>
+          </w:tcPr>
+          <w:p>
+            <w:r>
+              <w:t>0</w:t>
+            </w:r>
+          </w:p>
+        </w:tc>
+        <w:tc>
+          <w:tcPr>
+            <w:tcW w:w="1337" w:type="dxa"/>
+          </w:tcPr>
+          <w:p>
+            <w:r>
+              <w:t>DROP</w:t>
+            </w:r>
+          </w:p>
+        </w:tc>
+      </w:tr>
+      <w:tr>
+        <w:tc>
+          <w:tcPr>
+            <w:tcW w:w="1337" w:type="dxa"/>
+          </w:tcPr>
+          <w:p>
+            <w:r>
+              <w:t>20</w:t>
+            </w:r>
+          </w:p>
+        </w:tc>
+        <w:tc>
+          <w:tcPr>
+            <w:tcW w:w="1337" w:type="dxa"/>
+          </w:tcPr>
+          <w:p>
+            <w:r>
+              <w:t>43.0</w:t>
+            </w:r>
+          </w:p>
+        </w:tc>
+        <w:tc>
+          <w:tcPr>
+            <w:tcW w:w="1337" w:type="dxa"/>
+          </w:tcPr>
+          <w:p>
+            <w:r>
+              <w:t>0</w:t>
+            </w:r>
+          </w:p>
+        </w:tc>
+        <w:tc>
+          <w:tcPr>
+            <w:tcW w:w="1337" w:type="dxa"/>
+          </w:tcPr>
+          <w:p>
+            <w:r>
+              <w:t>0</w:t>
+            </w:r>
+          </w:p>
+        </w:tc>
+        <w:tc>
+          <w:tcPr>
+            <w:tcW w:w="1337" w:type="dxa"/>
+          </w:tcPr>
+          <w:p>
+            <w:r>
+              <w:t>0</w:t>
+            </w:r>
+          </w:p>
+        </w:tc>
+        <w:tc>
+          <w:tcPr>
+            <w:tcW w:w="1337" w:type="dxa"/>
+          </w:tcPr>
+          <w:p>
+            <w:r>
+              <w:t>0</w:t>
+            </w:r>
+          </w:p>
+        </w:tc>
+        <w:tc>
+          <w:tcPr>
+            <w:tcW w:w="1337" w:type="dxa"/>
+          </w:tcPr>
+          <w:p>
+            <w:r>
+              <w:t>ok</w:t>
+            </w:r>
+          </w:p>
+        </w:tc>
+      </w:tr>
+      <w:tr>
+        <w:tc>
+          <w:tcPr>
+            <w:tcW w:w="1337" w:type="dxa"/>
+          </w:tcPr>
+          <w:p>
+            <w:r>
+              <w:t>22</w:t>
+            </w:r>
+          </w:p>
+        </w:tc>
+        <w:tc>
+          <w:tcPr>
+            <w:tcW w:w="1337" w:type="dxa"/>
+          </w:tcPr>
+          <w:p>
+            <w:r>
+              <w:t>43.0</w:t>
+            </w:r>
+          </w:p>
+        </w:tc>
+        <w:tc>
+          <w:tcPr>
+            <w:tcW w:w="1337" w:type="dxa"/>
+          </w:tcPr>
+          <w:p>
+            <w:r>
+              <w:t>0</w:t>
+            </w:r>
+          </w:p>
+        </w:tc>
+        <w:tc>
+          <w:tcPr>
+            <w:tcW w:w="1337" w:type="dxa"/>
+          </w:tcPr>
+          <w:p>
+            <w:r>
+              <w:t>0</w:t>
+            </w:r>
+          </w:p>
+        </w:tc>
+        <w:tc>
+          <w:tcPr>
+            <w:tcW w:w="1337" w:type="dxa"/>
+          </w:tcPr>
+          <w:p>
+            <w:r>
+              <w:t>0</w:t>
+            </w:r>
+          </w:p>
+        </w:tc>
+        <w:tc>
+          <w:tcPr>
+            <w:tcW w:w="1337" w:type="dxa"/>
+          </w:tcPr>
+          <w:p>
+            <w:r>
+              <w:t>0</w:t>
+            </w:r>
+          </w:p>
+        </w:tc>
+        <w:tc>
+          <w:tcPr>
+            <w:tcW w:w="1337" w:type="dxa"/>
+          </w:tcPr>
+          <w:p>
+            <w:r>
+              <w:t>ok</w:t>
+            </w:r>
+          </w:p>
+        </w:tc>
+      </w:tr>
+      <w:tr>
+        <w:tc>
+          <w:tcPr>
+            <w:tcW w:w="1337" w:type="dxa"/>
+          </w:tcPr>
+          <w:p>
+            <w:r>
+              <w:t>24</w:t>
+            </w:r>
+          </w:p>
+        </w:tc>
+        <w:tc>
+          <w:tcPr>
+            <w:tcW w:w="1337" w:type="dxa"/>
+          </w:tcPr>
+          <w:p>
+            <w:r>
+              <w:t>39.0</w:t>
+            </w:r>
+          </w:p>
+        </w:tc>
+        <w:tc>
+          <w:tcPr>
+            <w:tcW w:w="1337" w:type="dxa"/>
+          </w:tcPr>
+          <w:p>
+            <w:r>
+              <w:t>0</w:t>
+            </w:r>
+          </w:p>
+        </w:tc>
+        <w:tc>
+          <w:tcPr>
+            <w:tcW w:w="1337" w:type="dxa"/>
+          </w:tcPr>
+          <w:p>
+            <w:r>
+              <w:t>0</w:t>
+            </w:r>
+          </w:p>
+        </w:tc>
+        <w:tc>
+          <w:tcPr>
+            <w:tcW w:w="1337" w:type="dxa"/>
+          </w:tcPr>
+          <w:p>
+            <w:r>
+              <w:t>0</w:t>
+            </w:r>
+          </w:p>
+        </w:tc>
+        <w:tc>
+          <w:tcPr>
+            <w:tcW w:w="1337" w:type="dxa"/>
+          </w:tcPr>
+          <w:p>
+            <w:r>
+              <w:t>0</w:t>
+            </w:r>
+          </w:p>
+        </w:tc>
+        <w:tc>
+          <w:tcPr>
+            <w:tcW w:w="1337" w:type="dxa"/>
+          </w:tcPr>
+          <w:p>
+            <w:r>
+              <w:t>DROP</w:t>
+            </w:r>
+          </w:p>
+        </w:tc>
+      </w:tr>
+      <w:tr>
+        <w:tc>
+          <w:tcPr>
+            <w:tcW w:w="1337" w:type="dxa"/>
+          </w:tcPr>
+          <w:p>
+            <w:r>
+              <w:t>60</w:t>
+            </w:r>
+          </w:p>
+        </w:tc>
+        <w:tc>
+          <w:tcPr>
+            <w:tcW w:w="1337" w:type="dxa"/>
+          </w:tcPr>
+          <w:p>
+            <w:r>
+              <w:t>28.0</w:t>
+            </w:r>
+          </w:p>
+        </w:tc>
+        <w:tc>
+          <w:tcPr>
+            <w:tcW w:w="1337" w:type="dxa"/>
+          </w:tcPr>
+          <w:p>
+            <w:r>
+              <w:t>0</w:t>
+            </w:r>
+          </w:p>
+        </w:tc>
+        <w:tc>
+          <w:tcPr>
+            <w:tcW w:w="1337" w:type="dxa"/>
+          </w:tcPr>
+          <w:p>
+            <w:r>
+              <w:t>0</w:t>
+            </w:r>
+          </w:p>
+        </w:tc>
+        <w:tc>
+          <w:tcPr>
+            <w:tcW w:w="1337" w:type="dxa"/>
+          </w:tcPr>
+          <w:p>
+            <w:r>
+              <w:t>0</w:t>
+            </w:r>
+          </w:p>
+        </w:tc>
+        <w:tc>
+          <w:tcPr>
+            <w:tcW w:w="1337" w:type="dxa"/>
+          </w:tcPr>
+          <w:p>
+            <w:r>
+              <w:t>0</w:t>
+            </w:r>
+          </w:p>
+        </w:tc>
+        <w:tc>
+          <w:tcPr>
+            <w:tcW w:w="1337" w:type="dxa"/>
+          </w:tcPr>
+          <w:p>
+            <w:r>
+              <w:t>DROP</w:t>
+            </w:r>
+          </w:p>
+        </w:tc>
+      </w:tr>
+    </w:tbl>
+    <w:p>
+      <w:r>
+        <w:t>All fleet sizes produced zero collisions, red-light violations, illegal running directions, and U-turns, consistent with the formal verification results: P3 safety (exactly one green at any time) and P1/P2 liveness (every direction eventually and infinitely often green) hold at every intersection.</w:t>
       </w:r>
     </w:p>
     <w:p>
@@ -1682,6 +2797,22 @@
         <w:pStyle w:val="1"/>
       </w:pPr>
       <w:r>
+        <w:t>12. Conclusion</w:t>
+      </w:r>
+    </w:p>
+    <w:p>
+      <w:pPr>
+        <w:spacing w:after="120"/>
+      </w:pPr>
+      <w:r>
+        <w:t>We modelled the i-group signal controller in Promela and used Spin to verify the three v-group spec properties (every direction eventually green, every direction infinitely often green, exactly one direction green at any time) on a worst-case interior intersection under uniform demand, and one self-chosen property (topology validity) on a corner intersection. P1, P2, and P3 hold; P4 fails on the original scheduler with a one-step counterexample at initialisation, and holds after a one-line patch to scheduler.initialize that we propose. The Promela files (signal_check.pml, signal_check_corner.pml, signal_check_corner_fixed.pml), the driver script (run_all.sh), and the saved logs are submitted alongside this report.</w:t>
+      </w:r>
+    </w:p>
+    <w:p>
+      <w:pPr>
+        <w:pStyle w:val="1"/>
+      </w:pPr>
+      <w:r>
         <w:t>Appendix A. Verification Commands and Logs</w:t>
       </w:r>
     </w:p>
@@ -1690,7 +2821,6 @@
         <w:spacing w:after="120"/>
       </w:pPr>
       <w:r>
-        <w:lastRenderedPageBreak/>
         <w:t>Environment:</w:t>
       </w:r>
     </w:p>
@@ -1746,6 +2876,7 @@
           <w:sz w:val="20"/>
           <w:szCs w:val="20"/>
         </w:rPr>
+        <w:lastRenderedPageBreak/>
         <w:t>spin -a -DSEL_p3_one_green signal_check.pml</w:t>
       </w:r>
       <w:r>
@@ -1973,13 +3104,6 @@
           <w:szCs w:val="20"/>
         </w:rPr>
         <w:br/>
-      </w:r>
-      <w:r>
-        <w:rPr>
-          <w:rFonts w:ascii="Consolas" w:eastAsia="Consolas" w:hAnsi="Consolas" w:cs="Consolas"/>
-          <w:sz w:val="20"/>
-          <w:szCs w:val="20"/>
-        </w:rPr>
         <w:t>gcc -O2 -o pan pan.c</w:t>
       </w:r>
       <w:r>
@@ -2139,7 +3263,6 @@
           <w:sz w:val="20"/>
           <w:szCs w:val="20"/>
         </w:rPr>
-        <w:lastRenderedPageBreak/>
         <w:t>spin -a signal_check_corner_fixed.pml</w:t>
       </w:r>
       <w:r>
@@ -2179,6 +3302,7 @@
         <w:pStyle w:val="1"/>
       </w:pPr>
       <w:r>
+        <w:lastRenderedPageBreak/>
         <w:t>Appendix B. Screenshot Inventory</w:t>
       </w:r>
     </w:p>
@@ -2280,7 +3404,7 @@
           <w:noProof/>
         </w:rPr>
         <w:drawing>
-          <wp:inline distT="0" distB="0" distL="0" distR="0" wp14:anchorId="5D8B9D7B" wp14:editId="3DB1DC15">
+          <wp:inline distT="0" distB="0" distL="0" distR="0" wp14:anchorId="5D8B9D7B" wp14:editId="74916943">
             <wp:extent cx="5943600" cy="3425190"/>
             <wp:effectExtent l="0" t="0" r="0" b="3810"/>
             <wp:docPr id="2" name="Picture 2" descr="A screenshot of a computer program  Description automatically generated"/>
@@ -2350,7 +3474,7 @@
         </w:rPr>
         <w:lastRenderedPageBreak/>
         <w:drawing>
-          <wp:inline distT="0" distB="0" distL="0" distR="0" wp14:anchorId="27B5CE75" wp14:editId="44098EA3">
+          <wp:inline distT="0" distB="0" distL="0" distR="0" wp14:anchorId="27B5CE75" wp14:editId="545FA6DE">
             <wp:extent cx="5943600" cy="3580130"/>
             <wp:effectExtent l="0" t="0" r="0" b="1270"/>
             <wp:docPr id="3" name="Picture 3" descr="A screenshot of a computer program  Description automatically generated"/>
@@ -2419,7 +3543,7 @@
           <w:noProof/>
         </w:rPr>
         <w:drawing>
-          <wp:inline distT="0" distB="0" distL="0" distR="0" wp14:anchorId="4F85144F" wp14:editId="1CF37CDB">
+          <wp:inline distT="0" distB="0" distL="0" distR="0" wp14:anchorId="4F85144F" wp14:editId="6034604F">
             <wp:extent cx="5943600" cy="3611245"/>
             <wp:effectExtent l="0" t="0" r="0" b="0"/>
             <wp:docPr id="4" name="Picture 4" descr="A screenshot of a computer program  Description automatically generated"/>
@@ -2628,7 +3752,7 @@
         </w:rPr>
         <w:lastRenderedPageBreak/>
         <w:drawing>
-          <wp:inline distT="0" distB="0" distL="0" distR="0" wp14:anchorId="4EE8FAC8" wp14:editId="3EB410C0">
+          <wp:inline distT="0" distB="0" distL="0" distR="0" wp14:anchorId="4EE8FAC8" wp14:editId="4D0F54C8">
             <wp:extent cx="5943600" cy="4544695"/>
             <wp:effectExtent l="0" t="0" r="0" b="1905"/>
             <wp:docPr id="7" name="Picture 7" descr="A screenshot of a computer program  Description automatically generated"/>

</xml_diff>